<commit_message>
Añadido info de curso de Zulismar
</commit_message>
<xml_diff>
--- a/Marco legal para la ingeniería informática/Unidad 3/Informe grupal, Marco legal para la ingenieria informática, IF01 T4.docx
+++ b/Marco legal para la ingeniería informática/Unidad 3/Informe grupal, Marco legal para la ingenieria informática, IF01 T4.docx
@@ -1077,6 +1077,208 @@
           <w:szCs w:val="24"/>
         </w:rPr>
       </w:pPr>
+    </w:p>
+    <w:p>
+      <w:pPr>
+        <w:spacing w:after="0" w:line="480" w:lineRule="auto"/>
+        <w:rPr>
+          <w:rFonts w:ascii="Arial" w:eastAsia="Arial" w:hAnsi="Arial" w:cs="Arial"/>
+          <w:b/>
+          <w:bCs/>
+          <w:color w:val="000000"/>
+          <w:szCs w:val="24"/>
+        </w:rPr>
+      </w:pPr>
+      <w:r>
+        <w:rPr>
+          <w:rFonts w:ascii="Arial" w:eastAsia="Arial" w:hAnsi="Arial" w:cs="Arial"/>
+          <w:b/>
+          <w:bCs/>
+          <w:noProof/>
+          <w:color w:val="000000"/>
+          <w:szCs w:val="24"/>
+          <w:lang w:eastAsia="es-VE"/>
+        </w:rPr>
+        <mc:AlternateContent>
+          <mc:Choice Requires="wps">
+            <w:drawing>
+              <wp:anchor distT="45720" distB="45720" distL="114300" distR="114300" simplePos="0" relativeHeight="251664384" behindDoc="0" locked="0" layoutInCell="1" hidden="0" allowOverlap="1" wp14:anchorId="01F495E2" wp14:editId="072B7476">
+                <wp:simplePos x="0" y="0"/>
+                <wp:positionH relativeFrom="margin">
+                  <wp:posOffset>1637665</wp:posOffset>
+                </wp:positionH>
+                <wp:positionV relativeFrom="margin">
+                  <wp:posOffset>7776065</wp:posOffset>
+                </wp:positionV>
+                <wp:extent cx="2667635" cy="287020"/>
+                <wp:effectExtent l="0" t="0" r="0" b="0"/>
+                <wp:wrapSquare wrapText="bothSides" distT="45720" distB="45720" distL="114300" distR="114300"/>
+                <wp:docPr id="12" name="Cuadro de texto 12"/>
+                <wp:cNvGraphicFramePr>
+                  <a:graphicFrameLocks xmlns:a="http://schemas.openxmlformats.org/drawingml/2006/main"/>
+                </wp:cNvGraphicFramePr>
+                <a:graphic xmlns:a="http://schemas.openxmlformats.org/drawingml/2006/main">
+                  <a:graphicData uri="http://schemas.microsoft.com/office/word/2010/wordprocessingShape">
+                    <wps:wsp>
+                      <wps:cNvSpPr txBox="1">
+                        <a:spLocks noChangeArrowheads="1"/>
+                      </wps:cNvSpPr>
+                      <wps:spPr bwMode="auto">
+                        <a:xfrm>
+                          <a:off x="0" y="0"/>
+                          <a:ext cx="2667635" cy="287020"/>
+                        </a:xfrm>
+                        <a:prstGeom prst="rect">
+                          <a:avLst/>
+                        </a:prstGeom>
+                        <a:noFill/>
+                        <a:ln w="9525">
+                          <a:noFill/>
+                          <a:miter lim="800000"/>
+                          <a:headEnd/>
+                          <a:tailEnd/>
+                        </a:ln>
+                      </wps:spPr>
+                      <wps:txbx>
+                        <w:txbxContent>
+                          <w:p>
+                            <w:pPr>
+                              <w:ind w:left="1416" w:hanging="1416"/>
+                              <w:jc w:val="center"/>
+                              <w:rPr>
+                                <w:rFonts w:cs="Times New Roman"/>
+                                <w:szCs w:val="24"/>
+                              </w:rPr>
+                            </w:pPr>
+                            <w:r>
+                              <w:rPr>
+                                <w:rFonts w:cs="Times New Roman"/>
+                                <w:szCs w:val="24"/>
+                              </w:rPr>
+                              <w:t>El</w:t>
+                            </w:r>
+                            <w:r>
+                              <w:rPr>
+                                <w:rFonts w:cs="Times New Roman"/>
+                                <w:szCs w:val="24"/>
+                              </w:rPr>
+                              <w:t xml:space="preserve"> Tigre, </w:t>
+                            </w:r>
+                            <w:r>
+                              <w:rPr>
+                                <w:rFonts w:cs="Times New Roman"/>
+                                <w:szCs w:val="24"/>
+                              </w:rPr>
+                              <w:t>09</w:t>
+                            </w:r>
+                            <w:r>
+                              <w:rPr>
+                                <w:rFonts w:cs="Times New Roman"/>
+                                <w:szCs w:val="24"/>
+                              </w:rPr>
+                              <w:t xml:space="preserve"> de </w:t>
+                            </w:r>
+                            <w:r>
+                              <w:rPr>
+                                <w:rFonts w:cs="Times New Roman"/>
+                                <w:szCs w:val="24"/>
+                              </w:rPr>
+                              <w:t>septiembre</w:t>
+                            </w:r>
+                            <w:r>
+                              <w:rPr>
+                                <w:rFonts w:cs="Times New Roman"/>
+                                <w:szCs w:val="24"/>
+                              </w:rPr>
+                              <w:t xml:space="preserve"> del 2025</w:t>
+                            </w:r>
+                          </w:p>
+                        </w:txbxContent>
+                      </wps:txbx>
+                      <wps:bodyPr rot="0" vert="horz" wrap="square" lIns="91440" tIns="45720" rIns="91440" bIns="45720" anchor="t" anchorCtr="0">
+                        <a:noAutofit/>
+                      </wps:bodyPr>
+                    </wps:wsp>
+                  </a:graphicData>
+                </a:graphic>
+                <wp14:sizeRelH relativeFrom="margin">
+                  <wp14:pctWidth>0</wp14:pctWidth>
+                </wp14:sizeRelH>
+                <wp14:sizeRelV relativeFrom="margin">
+                  <wp14:pctHeight>0</wp14:pctHeight>
+                </wp14:sizeRelV>
+              </wp:anchor>
+            </w:drawing>
+          </mc:Choice>
+          <mc:Fallback>
+            <w:pict>
+              <v:shapetype w14:anchorId="01F495E2" id="_x0000_t202" coordsize="21600,21600" o:spt="202" path="m,l,21600r21600,l21600,xe">
+                <v:stroke joinstyle="miter"/>
+                <v:path gradientshapeok="t" o:connecttype="rect"/>
+              </v:shapetype>
+              <v:shape id="Cuadro de texto 12" o:spid="_x0000_s1030" type="#_x0000_t202" style="position:absolute;left:0;text-align:left;margin-left:128.95pt;margin-top:612.3pt;width:210.05pt;height:22.6pt;z-index:251664384;visibility:visible;mso-wrap-style:square;mso-width-percent:0;mso-height-percent:0;mso-wrap-distance-left:9pt;mso-wrap-distance-top:3.6pt;mso-wrap-distance-right:9pt;mso-wrap-distance-bottom:3.6pt;mso-position-horizontal:absolute;mso-position-horizontal-relative:margin;mso-position-vertical:absolute;mso-position-vertical-relative:margin;mso-width-percent:0;mso-height-percent:0;mso-width-relative:margin;mso-height-relative:margin;v-text-anchor:top" o:gfxdata="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" filled="f" stroked="f">
+                <v:textbox>
+                  <w:txbxContent>
+                    <w:p>
+                      <w:pPr>
+                        <w:ind w:left="1416" w:hanging="1416"/>
+                        <w:jc w:val="center"/>
+                        <w:rPr>
+                          <w:rFonts w:cs="Times New Roman"/>
+                          <w:szCs w:val="24"/>
+                        </w:rPr>
+                      </w:pPr>
+                      <w:r>
+                        <w:rPr>
+                          <w:rFonts w:cs="Times New Roman"/>
+                          <w:szCs w:val="24"/>
+                        </w:rPr>
+                        <w:t>El</w:t>
+                      </w:r>
+                      <w:r>
+                        <w:rPr>
+                          <w:rFonts w:cs="Times New Roman"/>
+                          <w:szCs w:val="24"/>
+                        </w:rPr>
+                        <w:t xml:space="preserve"> Tigre, </w:t>
+                      </w:r>
+                      <w:r>
+                        <w:rPr>
+                          <w:rFonts w:cs="Times New Roman"/>
+                          <w:szCs w:val="24"/>
+                        </w:rPr>
+                        <w:t>09</w:t>
+                      </w:r>
+                      <w:r>
+                        <w:rPr>
+                          <w:rFonts w:cs="Times New Roman"/>
+                          <w:szCs w:val="24"/>
+                        </w:rPr>
+                        <w:t xml:space="preserve"> de </w:t>
+                      </w:r>
+                      <w:r>
+                        <w:rPr>
+                          <w:rFonts w:cs="Times New Roman"/>
+                          <w:szCs w:val="24"/>
+                        </w:rPr>
+                        <w:t>septiembre</w:t>
+                      </w:r>
+                      <w:r>
+                        <w:rPr>
+                          <w:rFonts w:cs="Times New Roman"/>
+                          <w:szCs w:val="24"/>
+                        </w:rPr>
+                        <w:t xml:space="preserve"> del 2025</w:t>
+                      </w:r>
+                    </w:p>
+                  </w:txbxContent>
+                </v:textbox>
+                <w10:wrap type="square" anchorx="margin" anchory="margin"/>
+              </v:shape>
+            </w:pict>
+          </mc:Fallback>
+        </mc:AlternateContent>
+      </w:r>
       <w:r>
         <w:rPr>
           <w:rFonts w:ascii="Arial" w:eastAsia="Arial" w:hAnsi="Arial" w:cs="Arial"/>
@@ -1224,216 +1426,6 @@
                           <w:szCs w:val="24"/>
                         </w:rPr>
                         <w:t>4</w:t>
-                      </w:r>
-                    </w:p>
-                  </w:txbxContent>
-                </v:textbox>
-                <w10:wrap type="square" anchorx="margin" anchory="margin"/>
-              </v:shape>
-            </w:pict>
-          </mc:Fallback>
-        </mc:AlternateContent>
-      </w:r>
-    </w:p>
-    <w:p>
-      <w:pPr>
-        <w:spacing w:after="0" w:line="480" w:lineRule="auto"/>
-        <w:rPr>
-          <w:rFonts w:ascii="Arial" w:eastAsia="Arial" w:hAnsi="Arial" w:cs="Arial"/>
-          <w:b/>
-          <w:bCs/>
-          <w:color w:val="000000"/>
-          <w:szCs w:val="24"/>
-        </w:rPr>
-      </w:pPr>
-    </w:p>
-    <w:p>
-      <w:pPr>
-        <w:spacing w:after="0" w:line="480" w:lineRule="auto"/>
-        <w:rPr>
-          <w:rFonts w:ascii="Arial" w:eastAsia="Arial" w:hAnsi="Arial" w:cs="Arial"/>
-          <w:b/>
-          <w:bCs/>
-          <w:color w:val="000000"/>
-          <w:szCs w:val="24"/>
-        </w:rPr>
-      </w:pPr>
-      <w:r>
-        <w:rPr>
-          <w:rFonts w:ascii="Arial" w:eastAsia="Arial" w:hAnsi="Arial" w:cs="Arial"/>
-          <w:b/>
-          <w:bCs/>
-          <w:noProof/>
-          <w:color w:val="000000"/>
-          <w:szCs w:val="24"/>
-          <w:lang w:eastAsia="es-VE"/>
-        </w:rPr>
-        <mc:AlternateContent>
-          <mc:Choice Requires="wps">
-            <w:drawing>
-              <wp:anchor distT="45720" distB="45720" distL="114300" distR="114300" simplePos="0" relativeHeight="251664384" behindDoc="0" locked="0" layoutInCell="1" hidden="0" allowOverlap="1" wp14:anchorId="01F495E2" wp14:editId="0C3AEB9E">
-                <wp:simplePos x="0" y="0"/>
-                <wp:positionH relativeFrom="margin">
-                  <wp:align>center</wp:align>
-                </wp:positionH>
-                <wp:positionV relativeFrom="margin">
-                  <wp:align>bottom</wp:align>
-                </wp:positionV>
-                <wp:extent cx="2667635" cy="287020"/>
-                <wp:effectExtent l="0" t="0" r="0" b="0"/>
-                <wp:wrapSquare wrapText="bothSides" distT="45720" distB="45720" distL="114300" distR="114300"/>
-                <wp:docPr id="12" name="Cuadro de texto 12"/>
-                <wp:cNvGraphicFramePr>
-                  <a:graphicFrameLocks xmlns:a="http://schemas.openxmlformats.org/drawingml/2006/main"/>
-                </wp:cNvGraphicFramePr>
-                <a:graphic xmlns:a="http://schemas.openxmlformats.org/drawingml/2006/main">
-                  <a:graphicData uri="http://schemas.microsoft.com/office/word/2010/wordprocessingShape">
-                    <wps:wsp>
-                      <wps:cNvSpPr txBox="1">
-                        <a:spLocks noChangeArrowheads="1"/>
-                      </wps:cNvSpPr>
-                      <wps:spPr bwMode="auto">
-                        <a:xfrm>
-                          <a:off x="0" y="0"/>
-                          <a:ext cx="2667635" cy="287020"/>
-                        </a:xfrm>
-                        <a:prstGeom prst="rect">
-                          <a:avLst/>
-                        </a:prstGeom>
-                        <a:noFill/>
-                        <a:ln w="9525">
-                          <a:noFill/>
-                          <a:miter lim="800000"/>
-                          <a:headEnd/>
-                          <a:tailEnd/>
-                        </a:ln>
-                      </wps:spPr>
-                      <wps:txbx>
-                        <w:txbxContent>
-                          <w:p>
-                            <w:pPr>
-                              <w:ind w:left="1416" w:hanging="1416"/>
-                              <w:jc w:val="center"/>
-                              <w:rPr>
-                                <w:rFonts w:cs="Times New Roman"/>
-                                <w:szCs w:val="24"/>
-                              </w:rPr>
-                            </w:pPr>
-                            <w:r>
-                              <w:rPr>
-                                <w:rFonts w:cs="Times New Roman"/>
-                                <w:szCs w:val="24"/>
-                              </w:rPr>
-                              <w:t>El</w:t>
-                            </w:r>
-                            <w:r>
-                              <w:rPr>
-                                <w:rFonts w:cs="Times New Roman"/>
-                                <w:szCs w:val="24"/>
-                              </w:rPr>
-                              <w:t xml:space="preserve"> Tigre, </w:t>
-                            </w:r>
-                            <w:r>
-                              <w:rPr>
-                                <w:rFonts w:cs="Times New Roman"/>
-                                <w:szCs w:val="24"/>
-                              </w:rPr>
-                              <w:t>09</w:t>
-                            </w:r>
-                            <w:r>
-                              <w:rPr>
-                                <w:rFonts w:cs="Times New Roman"/>
-                                <w:szCs w:val="24"/>
-                              </w:rPr>
-                              <w:t xml:space="preserve"> de </w:t>
-                            </w:r>
-                            <w:r>
-                              <w:rPr>
-                                <w:rFonts w:cs="Times New Roman"/>
-                                <w:szCs w:val="24"/>
-                              </w:rPr>
-                              <w:t>septiembre</w:t>
-                            </w:r>
-                            <w:r>
-                              <w:rPr>
-                                <w:rFonts w:cs="Times New Roman"/>
-                                <w:szCs w:val="24"/>
-                              </w:rPr>
-                              <w:t xml:space="preserve"> del 2025</w:t>
-                            </w:r>
-                          </w:p>
-                        </w:txbxContent>
-                      </wps:txbx>
-                      <wps:bodyPr rot="0" vert="horz" wrap="square" lIns="91440" tIns="45720" rIns="91440" bIns="45720" anchor="t" anchorCtr="0">
-                        <a:noAutofit/>
-                      </wps:bodyPr>
-                    </wps:wsp>
-                  </a:graphicData>
-                </a:graphic>
-                <wp14:sizeRelH relativeFrom="margin">
-                  <wp14:pctWidth>0</wp14:pctWidth>
-                </wp14:sizeRelH>
-                <wp14:sizeRelV relativeFrom="margin">
-                  <wp14:pctHeight>0</wp14:pctHeight>
-                </wp14:sizeRelV>
-              </wp:anchor>
-            </w:drawing>
-          </mc:Choice>
-          <mc:Fallback>
-            <w:pict>
-              <v:shape w14:anchorId="01F495E2" id="Cuadro de texto 12" o:spid="_x0000_s1031" type="#_x0000_t202" style="position:absolute;left:0;text-align:left;margin-left:0;margin-top:0;width:210.05pt;height:22.6pt;z-index:251664384;visibility:visible;mso-wrap-style:square;mso-width-percent:0;mso-height-percent:0;mso-wrap-distance-left:9pt;mso-wrap-distance-top:3.6pt;mso-wrap-distance-right:9pt;mso-wrap-distance-bottom:3.6pt;mso-position-horizontal:center;mso-position-horizontal-relative:margin;mso-position-vertical:bottom;mso-position-vertical-relative:margin;mso-width-percent:0;mso-height-percent:0;mso-width-relative:margin;mso-height-relative:margin;v-text-anchor:top" o:gfxdata="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" filled="f" stroked="f">
-                <v:textbox>
-                  <w:txbxContent>
-                    <w:p>
-                      <w:pPr>
-                        <w:ind w:left="1416" w:hanging="1416"/>
-                        <w:jc w:val="center"/>
-                        <w:rPr>
-                          <w:rFonts w:cs="Times New Roman"/>
-                          <w:szCs w:val="24"/>
-                        </w:rPr>
-                      </w:pPr>
-                      <w:r>
-                        <w:rPr>
-                          <w:rFonts w:cs="Times New Roman"/>
-                          <w:szCs w:val="24"/>
-                        </w:rPr>
-                        <w:t>El</w:t>
-                      </w:r>
-                      <w:r>
-                        <w:rPr>
-                          <w:rFonts w:cs="Times New Roman"/>
-                          <w:szCs w:val="24"/>
-                        </w:rPr>
-                        <w:t xml:space="preserve"> Tigre, </w:t>
-                      </w:r>
-                      <w:r>
-                        <w:rPr>
-                          <w:rFonts w:cs="Times New Roman"/>
-                          <w:szCs w:val="24"/>
-                        </w:rPr>
-                        <w:t>09</w:t>
-                      </w:r>
-                      <w:r>
-                        <w:rPr>
-                          <w:rFonts w:cs="Times New Roman"/>
-                          <w:szCs w:val="24"/>
-                        </w:rPr>
-                        <w:t xml:space="preserve"> de </w:t>
-                      </w:r>
-                      <w:r>
-                        <w:rPr>
-                          <w:rFonts w:cs="Times New Roman"/>
-                          <w:szCs w:val="24"/>
-                        </w:rPr>
-                        <w:t>septiembre</w:t>
-                      </w:r>
-                      <w:r>
-                        <w:rPr>
-                          <w:rFonts w:cs="Times New Roman"/>
-                          <w:szCs w:val="24"/>
-                        </w:rPr>
-                        <w:t xml:space="preserve"> del 2025</w:t>
                       </w:r>
                     </w:p>
                   </w:txbxContent>

</xml_diff>